<commit_message>
sauvegarde de securite avant restructuration multi-branches
</commit_message>
<xml_diff>
--- a/procedure_de_test/Fiche de recette creation d'equipe.docx
+++ b/procedure_de_test/Fiche de recette creation d'equipe.docx
@@ -21,37 +21,42 @@
         <w:t xml:space="preserve">Fiche de recette </w:t>
       </w:r>
     </w:p>
-    <w:p/>
     <w:p>
       <w:pPr>
         <w:rPr>
-          <w:b/>
+          <w:sz w:val="28"/>
+        </w:rPr>
+      </w:pPr>
+      <w:r>
+        <w:rPr>
+          <w:sz w:val="28"/>
+        </w:rPr>
+        <w:t xml:space="preserve">Test de </w:t>
+      </w:r>
+      <w:r>
+        <w:rPr>
           <w:sz w:val="26"/>
           <w:szCs w:val="26"/>
         </w:rPr>
-      </w:pPr>
+        <w:t>création</w:t>
+      </w:r>
       <w:r>
         <w:rPr>
-          <w:b/>
-          <w:sz w:val="26"/>
-          <w:szCs w:val="26"/>
-        </w:rPr>
-        <w:t>Test de :</w:t>
+          <w:sz w:val="28"/>
+        </w:rPr>
+        <w:t xml:space="preserve"> d'équipe</w:t>
       </w:r>
     </w:p>
     <w:p>
       <w:r>
         <w:t>Objectif :</w:t>
       </w:r>
-    </w:p>
-    <w:p>
-      <w:pPr>
-        <w:rPr>
-          <w:b/>
-          <w:sz w:val="26"/>
-          <w:szCs w:val="26"/>
-        </w:rPr>
-      </w:pPr>
+      <w:r>
+        <w:t xml:space="preserve"> </w:t>
+      </w:r>
+      <w:r>
+        <w:t>Vérifier que l'organisateur peut créer une équipe en lui associant un badge RFID via le logiciel.</w:t>
+      </w:r>
     </w:p>
     <w:p>
       <w:pPr>
@@ -72,31 +77,29 @@
     </w:p>
     <w:p>
       <w:r>
-        <w:t>- Configuration :</w:t>
+        <w:t>- Configuration : </w:t>
+      </w:r>
+      <w:r>
+        <w:t>L'application est lancée, l'accès se fait dans l'onglet « Inscriptions Équipes ».</w:t>
       </w:r>
     </w:p>
     <w:p>
       <w:r>
-        <w:t>- Test de :</w:t>
-      </w:r>
-    </w:p>
-    <w:p>
-      <w:r>
-        <w:t>- Test de :</w:t>
+        <w:t>- Test de création et de suppression d’équipe</w:t>
       </w:r>
     </w:p>
     <w:tbl>
       <w:tblPr>
         <w:tblStyle w:val="Grilledutableau"/>
-        <w:tblW w:w="0" w:type="auto"/>
+        <w:tblW w:w="9493" w:type="dxa"/>
         <w:tblLook w:val="04A0" w:firstRow="1" w:lastRow="0" w:firstColumn="1" w:lastColumn="0" w:noHBand="0" w:noVBand="1"/>
       </w:tblPr>
       <w:tblGrid>
         <w:gridCol w:w="562"/>
-        <w:gridCol w:w="2127"/>
-        <w:gridCol w:w="2551"/>
-        <w:gridCol w:w="1843"/>
-        <w:gridCol w:w="1979"/>
+        <w:gridCol w:w="2410"/>
+        <w:gridCol w:w="3686"/>
+        <w:gridCol w:w="1559"/>
+        <w:gridCol w:w="1276"/>
       </w:tblGrid>
       <w:tr>
         <w:tc>
@@ -120,7 +123,7 @@
         </w:tc>
         <w:tc>
           <w:tcPr>
-            <w:tcW w:w="2127" w:type="dxa"/>
+            <w:tcW w:w="2410" w:type="dxa"/>
             <w:shd w:val="clear" w:color="auto" w:fill="000000" w:themeFill="text1"/>
           </w:tcPr>
           <w:p>
@@ -139,7 +142,7 @@
         </w:tc>
         <w:tc>
           <w:tcPr>
-            <w:tcW w:w="2551" w:type="dxa"/>
+            <w:tcW w:w="3686" w:type="dxa"/>
             <w:shd w:val="clear" w:color="auto" w:fill="000000" w:themeFill="text1"/>
           </w:tcPr>
           <w:p>
@@ -158,7 +161,7 @@
         </w:tc>
         <w:tc>
           <w:tcPr>
-            <w:tcW w:w="1843" w:type="dxa"/>
+            <w:tcW w:w="1559" w:type="dxa"/>
             <w:shd w:val="clear" w:color="auto" w:fill="000000" w:themeFill="text1"/>
           </w:tcPr>
           <w:p>
@@ -177,7 +180,7 @@
         </w:tc>
         <w:tc>
           <w:tcPr>
-            <w:tcW w:w="1979" w:type="dxa"/>
+            <w:tcW w:w="1276" w:type="dxa"/>
             <w:shd w:val="clear" w:color="auto" w:fill="000000" w:themeFill="text1"/>
           </w:tcPr>
           <w:p>
@@ -208,29 +211,54 @@
         </w:tc>
         <w:tc>
           <w:tcPr>
-            <w:tcW w:w="2127" w:type="dxa"/>
-          </w:tcPr>
-          <w:p/>
-        </w:tc>
-        <w:tc>
-          <w:tcPr>
-            <w:tcW w:w="2551" w:type="dxa"/>
-          </w:tcPr>
-          <w:p/>
-        </w:tc>
-        <w:tc>
-          <w:tcPr>
-            <w:tcW w:w="1843" w:type="dxa"/>
-          </w:tcPr>
-          <w:p/>
-        </w:tc>
-        <w:tc>
-          <w:tcPr>
-            <w:tcW w:w="1979" w:type="dxa"/>
-          </w:tcPr>
-          <w:p>
-            <w:r>
-              <w:t>Oui / Non</w:t>
+            <w:tcW w:w="2410" w:type="dxa"/>
+          </w:tcPr>
+          <w:p>
+            <w:r>
+              <w:t>Passer un badge RFID devant une balise</w:t>
+            </w:r>
+          </w:p>
+        </w:tc>
+        <w:tc>
+          <w:tcPr>
+            <w:tcW w:w="3686" w:type="dxa"/>
+          </w:tcPr>
+          <w:p>
+            <w:r>
+              <w:t xml:space="preserve">Le badge est capté par le </w:t>
+            </w:r>
+            <w:proofErr w:type="spellStart"/>
+            <w:r>
+              <w:t>LoraThread</w:t>
+            </w:r>
+            <w:proofErr w:type="spellEnd"/>
+            <w:r>
+              <w:t xml:space="preserve"> et sauvegardé dans </w:t>
+            </w:r>
+            <w:proofErr w:type="spellStart"/>
+            <w:r>
+              <w:t>donnees_rfid.json</w:t>
+            </w:r>
+            <w:proofErr w:type="spellEnd"/>
+          </w:p>
+        </w:tc>
+        <w:tc>
+          <w:tcPr>
+            <w:tcW w:w="1559" w:type="dxa"/>
+          </w:tcPr>
+          <w:p>
+            <w:r>
+              <w:t>Conforme</w:t>
+            </w:r>
+          </w:p>
+        </w:tc>
+        <w:tc>
+          <w:tcPr>
+            <w:tcW w:w="1276" w:type="dxa"/>
+          </w:tcPr>
+          <w:p>
+            <w:r>
+              <w:t xml:space="preserve">Oui </w:t>
             </w:r>
           </w:p>
         </w:tc>
@@ -249,31 +277,47 @@
         </w:tc>
         <w:tc>
           <w:tcPr>
-            <w:tcW w:w="2127" w:type="dxa"/>
+            <w:tcW w:w="2410" w:type="dxa"/>
             <w:shd w:val="clear" w:color="auto" w:fill="F2F2F2" w:themeFill="background1" w:themeFillShade="F2"/>
           </w:tcPr>
-          <w:p/>
-        </w:tc>
-        <w:tc>
-          <w:tcPr>
-            <w:tcW w:w="2551" w:type="dxa"/>
+          <w:p>
+            <w:r>
+              <w:t>Cliquer sur « Lire dernier RFID »</w:t>
+            </w:r>
+          </w:p>
+        </w:tc>
+        <w:tc>
+          <w:tcPr>
+            <w:tcW w:w="3686" w:type="dxa"/>
             <w:shd w:val="clear" w:color="auto" w:fill="F2F2F2" w:themeFill="background1" w:themeFillShade="F2"/>
           </w:tcPr>
-          <w:p/>
-        </w:tc>
-        <w:tc>
-          <w:tcPr>
-            <w:tcW w:w="1843" w:type="dxa"/>
+          <w:p>
+            <w:r>
+              <w:t>Le champ badge se remplit automatiquement avec le dernier badge scanné</w:t>
+            </w:r>
+          </w:p>
+        </w:tc>
+        <w:tc>
+          <w:tcPr>
+            <w:tcW w:w="1559" w:type="dxa"/>
             <w:shd w:val="clear" w:color="auto" w:fill="F2F2F2" w:themeFill="background1" w:themeFillShade="F2"/>
           </w:tcPr>
-          <w:p/>
-        </w:tc>
-        <w:tc>
-          <w:tcPr>
-            <w:tcW w:w="1979" w:type="dxa"/>
+          <w:p>
+            <w:r>
+              <w:t>Conforme</w:t>
+            </w:r>
+          </w:p>
+        </w:tc>
+        <w:tc>
+          <w:tcPr>
+            <w:tcW w:w="1276" w:type="dxa"/>
             <w:shd w:val="clear" w:color="auto" w:fill="F2F2F2" w:themeFill="background1" w:themeFillShade="F2"/>
           </w:tcPr>
-          <w:p/>
+          <w:p>
+            <w:r>
+              <w:t xml:space="preserve">Oui </w:t>
+            </w:r>
+          </w:p>
         </w:tc>
       </w:tr>
       <w:tr>
@@ -289,27 +333,43 @@
         </w:tc>
         <w:tc>
           <w:tcPr>
-            <w:tcW w:w="2127" w:type="dxa"/>
-          </w:tcPr>
-          <w:p/>
-        </w:tc>
-        <w:tc>
-          <w:tcPr>
-            <w:tcW w:w="2551" w:type="dxa"/>
-          </w:tcPr>
-          <w:p/>
-        </w:tc>
-        <w:tc>
-          <w:tcPr>
-            <w:tcW w:w="1843" w:type="dxa"/>
-          </w:tcPr>
-          <w:p/>
-        </w:tc>
-        <w:tc>
-          <w:tcPr>
-            <w:tcW w:w="1979" w:type="dxa"/>
-          </w:tcPr>
-          <w:p/>
+            <w:tcW w:w="2410" w:type="dxa"/>
+          </w:tcPr>
+          <w:p>
+            <w:r>
+              <w:t>Saisir un nom d'équipe et cliquer sur « Créer l'équipe »</w:t>
+            </w:r>
+          </w:p>
+        </w:tc>
+        <w:tc>
+          <w:tcPr>
+            <w:tcW w:w="3686" w:type="dxa"/>
+          </w:tcPr>
+          <w:p>
+            <w:r>
+              <w:t>L'équipe est créée et apparaît dans le tableau de la liste des équipes</w:t>
+            </w:r>
+          </w:p>
+        </w:tc>
+        <w:tc>
+          <w:tcPr>
+            <w:tcW w:w="1559" w:type="dxa"/>
+          </w:tcPr>
+          <w:p>
+            <w:r>
+              <w:t>Conforme</w:t>
+            </w:r>
+          </w:p>
+        </w:tc>
+        <w:tc>
+          <w:tcPr>
+            <w:tcW w:w="1276" w:type="dxa"/>
+          </w:tcPr>
+          <w:p>
+            <w:r>
+              <w:t xml:space="preserve">Oui </w:t>
+            </w:r>
+          </w:p>
         </w:tc>
       </w:tr>
       <w:tr>
@@ -326,31 +386,47 @@
         </w:tc>
         <w:tc>
           <w:tcPr>
-            <w:tcW w:w="2127" w:type="dxa"/>
+            <w:tcW w:w="2410" w:type="dxa"/>
             <w:shd w:val="clear" w:color="auto" w:fill="F2F2F2" w:themeFill="background1" w:themeFillShade="F2"/>
           </w:tcPr>
-          <w:p/>
-        </w:tc>
-        <w:tc>
-          <w:tcPr>
-            <w:tcW w:w="2551" w:type="dxa"/>
+          <w:p>
+            <w:r>
+              <w:t>Tenter de créer une équipe avec un badge déjà attribué</w:t>
+            </w:r>
+          </w:p>
+        </w:tc>
+        <w:tc>
+          <w:tcPr>
+            <w:tcW w:w="3686" w:type="dxa"/>
             <w:shd w:val="clear" w:color="auto" w:fill="F2F2F2" w:themeFill="background1" w:themeFillShade="F2"/>
           </w:tcPr>
-          <w:p/>
-        </w:tc>
-        <w:tc>
-          <w:tcPr>
-            <w:tcW w:w="1843" w:type="dxa"/>
+          <w:p>
+            <w:r>
+              <w:t>Un message d'erreur indique que le badge est déjà assigné à une autre équipe</w:t>
+            </w:r>
+          </w:p>
+        </w:tc>
+        <w:tc>
+          <w:tcPr>
+            <w:tcW w:w="1559" w:type="dxa"/>
             <w:shd w:val="clear" w:color="auto" w:fill="F2F2F2" w:themeFill="background1" w:themeFillShade="F2"/>
           </w:tcPr>
-          <w:p/>
-        </w:tc>
-        <w:tc>
-          <w:tcPr>
-            <w:tcW w:w="1979" w:type="dxa"/>
+          <w:p>
+            <w:r>
+              <w:t>Conforme</w:t>
+            </w:r>
+          </w:p>
+        </w:tc>
+        <w:tc>
+          <w:tcPr>
+            <w:tcW w:w="1276" w:type="dxa"/>
             <w:shd w:val="clear" w:color="auto" w:fill="F2F2F2" w:themeFill="background1" w:themeFillShade="F2"/>
           </w:tcPr>
-          <w:p/>
+          <w:p>
+            <w:r>
+              <w:t xml:space="preserve">Oui </w:t>
+            </w:r>
+          </w:p>
         </w:tc>
       </w:tr>
       <w:tr>
@@ -366,75 +442,47 @@
         </w:tc>
         <w:tc>
           <w:tcPr>
-            <w:tcW w:w="2127" w:type="dxa"/>
-          </w:tcPr>
-          <w:p/>
-        </w:tc>
-        <w:tc>
-          <w:tcPr>
-            <w:tcW w:w="2551" w:type="dxa"/>
-          </w:tcPr>
-          <w:p/>
-        </w:tc>
-        <w:tc>
-          <w:tcPr>
-            <w:tcW w:w="1843" w:type="dxa"/>
-          </w:tcPr>
-          <w:p/>
-        </w:tc>
-        <w:tc>
-          <w:tcPr>
-            <w:tcW w:w="1979" w:type="dxa"/>
-          </w:tcPr>
-          <w:p/>
-        </w:tc>
-      </w:tr>
-      <w:tr>
-        <w:tc>
-          <w:tcPr>
-            <w:tcW w:w="562" w:type="dxa"/>
-            <w:shd w:val="clear" w:color="auto" w:fill="F2F2F2" w:themeFill="background1" w:themeFillShade="F2"/>
-          </w:tcPr>
-          <w:p>
-            <w:r>
-              <w:t>6</w:t>
-            </w:r>
-          </w:p>
-        </w:tc>
-        <w:tc>
-          <w:tcPr>
-            <w:tcW w:w="2127" w:type="dxa"/>
-            <w:shd w:val="clear" w:color="auto" w:fill="F2F2F2" w:themeFill="background1" w:themeFillShade="F2"/>
-          </w:tcPr>
-          <w:p/>
-        </w:tc>
-        <w:tc>
-          <w:tcPr>
-            <w:tcW w:w="2551" w:type="dxa"/>
-            <w:shd w:val="clear" w:color="auto" w:fill="F2F2F2" w:themeFill="background1" w:themeFillShade="F2"/>
-          </w:tcPr>
-          <w:p/>
-        </w:tc>
-        <w:tc>
-          <w:tcPr>
-            <w:tcW w:w="1843" w:type="dxa"/>
-            <w:shd w:val="clear" w:color="auto" w:fill="F2F2F2" w:themeFill="background1" w:themeFillShade="F2"/>
-          </w:tcPr>
-          <w:p/>
-        </w:tc>
-        <w:tc>
-          <w:tcPr>
-            <w:tcW w:w="1979" w:type="dxa"/>
-            <w:shd w:val="clear" w:color="auto" w:fill="F2F2F2" w:themeFill="background1" w:themeFillShade="F2"/>
-          </w:tcPr>
-          <w:p/>
+            <w:tcW w:w="2410" w:type="dxa"/>
+          </w:tcPr>
+          <w:p>
+            <w:r>
+              <w:t>Sélectionner une équipe et cliquer sur « Supprimer la sélection »</w:t>
+            </w:r>
+          </w:p>
+        </w:tc>
+        <w:tc>
+          <w:tcPr>
+            <w:tcW w:w="3686" w:type="dxa"/>
+          </w:tcPr>
+          <w:p>
+            <w:r>
+              <w:t>Une confirmation apparaît puis l'équipe est supprimée du tableau</w:t>
+            </w:r>
+          </w:p>
+        </w:tc>
+        <w:tc>
+          <w:tcPr>
+            <w:tcW w:w="1559" w:type="dxa"/>
+          </w:tcPr>
+          <w:p>
+            <w:r>
+              <w:t>Conforme</w:t>
+            </w:r>
+          </w:p>
+        </w:tc>
+        <w:tc>
+          <w:tcPr>
+            <w:tcW w:w="1276" w:type="dxa"/>
+          </w:tcPr>
+          <w:p>
+            <w:r>
+              <w:t xml:space="preserve">Oui </w:t>
+            </w:r>
+          </w:p>
         </w:tc>
       </w:tr>
     </w:tbl>
-    <w:p>
-      <w:bookmarkStart w:id="0" w:name="_GoBack"/>
-      <w:bookmarkEnd w:id="0"/>
-    </w:p>
+    <w:p/>
     <w:p>
       <w:pPr>
         <w:rPr>
@@ -581,11 +629,12 @@
             </w:rPr>
             <w:id w:val="-418186509"/>
             <w14:checkbox>
-              <w14:checked w14:val="0"/>
+              <w14:checked w14:val="1"/>
               <w14:checkedState w14:val="2612" w14:font="MS Gothic"/>
               <w14:uncheckedState w14:val="2610" w14:font="MS Gothic"/>
             </w14:checkbox>
           </w:sdtPr>
+          <w:sdtEndPr/>
           <w:sdtContent>
             <w:tc>
               <w:tcPr>
@@ -611,7 +660,7 @@
                     <w:sz w:val="24"/>
                     <w:szCs w:val="24"/>
                   </w:rPr>
-                  <w:t>☐</w:t>
+                  <w:t>☒</w:t>
                 </w:r>
               </w:p>
             </w:tc>
@@ -647,11 +696,12 @@
             </w:rPr>
             <w:id w:val="905181637"/>
             <w14:checkbox>
-              <w14:checked w14:val="0"/>
+              <w14:checked w14:val="1"/>
               <w14:checkedState w14:val="2612" w14:font="MS Gothic"/>
               <w14:uncheckedState w14:val="2610" w14:font="MS Gothic"/>
             </w14:checkbox>
           </w:sdtPr>
+          <w:sdtEndPr/>
           <w:sdtContent>
             <w:tc>
               <w:tcPr>
@@ -672,7 +722,7 @@
                     <w:sz w:val="24"/>
                     <w:szCs w:val="24"/>
                   </w:rPr>
-                  <w:t>☐</w:t>
+                  <w:t>☒</w:t>
                 </w:r>
               </w:p>
             </w:tc>
@@ -709,11 +759,12 @@
             </w:rPr>
             <w:id w:val="63229795"/>
             <w14:checkbox>
-              <w14:checked w14:val="0"/>
+              <w14:checked w14:val="1"/>
               <w14:checkedState w14:val="2612" w14:font="MS Gothic"/>
               <w14:uncheckedState w14:val="2610" w14:font="MS Gothic"/>
             </w14:checkbox>
           </w:sdtPr>
+          <w:sdtEndPr/>
           <w:sdtContent>
             <w:tc>
               <w:tcPr>
@@ -736,7 +787,7 @@
                     <w:sz w:val="24"/>
                     <w:szCs w:val="24"/>
                   </w:rPr>
-                  <w:t>☐</w:t>
+                  <w:t>☒</w:t>
                 </w:r>
               </w:p>
             </w:tc>
@@ -780,6 +831,7 @@
               <w14:uncheckedState w14:val="2610" w14:font="MS Gothic"/>
             </w14:checkbox>
           </w:sdtPr>
+          <w:sdtEndPr/>
           <w:sdtContent>
             <w:tc>
               <w:tcPr>
@@ -843,6 +895,7 @@
               <w14:uncheckedState w14:val="2610" w14:font="MS Gothic"/>
             </w14:checkbox>
           </w:sdtPr>
+          <w:sdtEndPr/>
           <w:sdtContent>
             <w:tc>
               <w:tcPr>
@@ -905,6 +958,7 @@
               <w14:uncheckedState w14:val="2610" w14:font="MS Gothic"/>
             </w14:checkbox>
           </w:sdtPr>
+          <w:sdtEndPr/>
           <w:sdtContent>
             <w:tc>
               <w:tcPr>
@@ -971,6 +1025,7 @@
               <w14:uncheckedState w14:val="2610" w14:font="MS Gothic"/>
             </w14:checkbox>
           </w:sdtPr>
+          <w:sdtEndPr/>
           <w:sdtContent>
             <w:tc>
               <w:tcPr>
@@ -1034,6 +1089,7 @@
               <w14:uncheckedState w14:val="2610" w14:font="MS Gothic"/>
             </w14:checkbox>
           </w:sdtPr>
+          <w:sdtEndPr/>
           <w:sdtContent>
             <w:tc>
               <w:tcPr>
@@ -1096,6 +1152,7 @@
               <w14:uncheckedState w14:val="2610" w14:font="MS Gothic"/>
             </w14:checkbox>
           </w:sdtPr>
+          <w:sdtEndPr/>
           <w:sdtContent>
             <w:tc>
               <w:tcPr>
@@ -1202,11 +1259,12 @@
             </w:rPr>
             <w:id w:val="734206600"/>
             <w14:checkbox>
-              <w14:checked w14:val="0"/>
+              <w14:checked w14:val="1"/>
               <w14:checkedState w14:val="2612" w14:font="MS Gothic"/>
               <w14:uncheckedState w14:val="2610" w14:font="MS Gothic"/>
             </w14:checkbox>
           </w:sdtPr>
+          <w:sdtEndPr/>
           <w:sdtContent>
             <w:tc>
               <w:tcPr>
@@ -1227,7 +1285,7 @@
                     <w:sz w:val="24"/>
                     <w:szCs w:val="24"/>
                   </w:rPr>
-                  <w:t>☐</w:t>
+                  <w:t>☒</w:t>
                 </w:r>
               </w:p>
             </w:tc>
@@ -1269,6 +1327,7 @@
               <w14:uncheckedState w14:val="2610" w14:font="MS Gothic"/>
             </w14:checkbox>
           </w:sdtPr>
+          <w:sdtEndPr/>
           <w:sdtContent>
             <w:tc>
               <w:tcPr>
@@ -1322,66 +1381,16 @@
         </w:rPr>
         <w:t>Commentaires :</w:t>
       </w:r>
-    </w:p>
-    <w:p>
-      <w:pPr>
+      <w:r>
         <w:rPr>
           <w:b/>
           <w:sz w:val="26"/>
           <w:szCs w:val="26"/>
         </w:rPr>
-      </w:pPr>
-      <w:r>
-        <w:rPr>
-          <w:b/>
-          <w:sz w:val="26"/>
-          <w:szCs w:val="26"/>
-        </w:rPr>
-        <w:t>Anomalie à corriger :</w:t>
-      </w:r>
-    </w:p>
-    <w:p>
-      <w:pPr>
-        <w:rPr>
-          <w:sz w:val="24"/>
-          <w:szCs w:val="24"/>
-        </w:rPr>
-      </w:pPr>
-      <w:r>
-        <w:rPr>
-          <w:sz w:val="24"/>
-          <w:szCs w:val="24"/>
-        </w:rPr>
-        <w:t>- intégrer</w:t>
+        <w:t xml:space="preserve"> </w:t>
       </w:r>
       <w:r>
-        <w:rPr>
-          <w:sz w:val="24"/>
-          <w:szCs w:val="24"/>
-        </w:rPr>
-        <w:t> ...</w:t>
-      </w:r>
-    </w:p>
-    <w:p>
-      <w:pPr>
-        <w:rPr>
-          <w:sz w:val="24"/>
-          <w:szCs w:val="24"/>
-        </w:rPr>
-      </w:pPr>
-      <w:r>
-        <w:rPr>
-          <w:sz w:val="24"/>
-          <w:szCs w:val="24"/>
-        </w:rPr>
-        <w:t>- changer</w:t>
-      </w:r>
-      <w:r>
-        <w:rPr>
-          <w:sz w:val="24"/>
-          <w:szCs w:val="24"/>
-        </w:rPr>
-        <w:t> ...</w:t>
+        <w:t>Les fonctions sont toutes fonctionnelles et marche sans erreur</w:t>
       </w:r>
     </w:p>
     <w:p>
@@ -1419,7 +1428,37 @@
           <w:sz w:val="24"/>
           <w:szCs w:val="24"/>
         </w:rPr>
-        <w:t xml:space="preserve">             ...                                                          ../../....                                                          ...</w:t>
+        <w:t xml:space="preserve">            Tom Le Beuze                               10/05/2026</w:t>
+      </w:r>
+      <w:r>
+        <w:rPr>
+          <w:sz w:val="24"/>
+          <w:szCs w:val="24"/>
+        </w:rPr>
+        <w:t xml:space="preserve">               </w:t>
+      </w:r>
+      <w:r>
+        <w:rPr>
+          <w:sz w:val="24"/>
+          <w:szCs w:val="24"/>
+        </w:rPr>
+        <w:t xml:space="preserve">     </w:t>
+      </w:r>
+      <w:bookmarkStart w:id="0" w:name="_GoBack"/>
+      <w:bookmarkEnd w:id="0"/>
+      <w:r>
+        <w:rPr>
+          <w:sz w:val="24"/>
+          <w:szCs w:val="24"/>
+        </w:rPr>
+        <w:t xml:space="preserve">  </w:t>
+      </w:r>
+      <w:r>
+        <w:rPr>
+          <w:sz w:val="24"/>
+          <w:szCs w:val="24"/>
+        </w:rPr>
+        <w:t xml:space="preserve">                             LE BEUZE</w:t>
       </w:r>
     </w:p>
     <w:sectPr>

</xml_diff>